<commit_message>
Update paper with natural writing style revisions
Co-Authored-By: Claude Sonnet 4.6 <noreply@anthropic.com>
</commit_message>
<xml_diff>
--- a/MNF_Paper_Final.docx
+++ b/MNF_Paper_Final.docx
@@ -129,7 +129,7 @@
           <w:i w:val="0"/>
           <w:sz w:val="24"/>
         </w:rPr>
-        <w:t>The Minimum Noise Fraction (MNF) transform is a widely used method for noise reduction in hyperspectral imaging; conventional one-dimensional noise estimation techniques fail to consider correlation among neighbouring pixels, reducing their ability to model noise effectively. Additionally, the standard MNF approach often struggles with low-variance spectral bands due to singular covariance matrices. To address these challenges, the present work introduces a Python-based MNF library that incorporates a Three-Pixel Noise Estimation (TPNE) method, which captures noise in multiple spatial directions, and a Four-Pixel Noise Estimation (4PNE) method that extends TPNE with an additional directional component. The library also integrates an adaptive regularisation scheme for stable covariance inversion. Experimental results on a high-resolution reflectance hyperspectral dataset (40 bands, 2199 × 1280 pixels) demonstrate that both TPNE and 4PNE consistently improve noise suppression in 100% of spectral bands, with TPNE outperforming the conventional next-pixel approach on SNR gain in 35 of 40 bands.</w:t>
+        <w:t>The Minimum Noise Fraction (MNF) transform is a widely used method for noise reduction in hyperspectral imaging. Conventional one-dimensional noise estimation techniques do not consider correlation amongst neighbouring pixels, which reduces their ability to model noise properly. Also, the standard MNF approach often fails for low-variance spectral bands due to singular covariance matrices. To address these problems, this work presents a Python-based MNF library that uses a Three-Pixel Noise Estimation (TPNE) method which captures noise in multiple spatial directions, and a Four-Pixel Noise Estimation (4PNE) method that further extends TPNE by adding one more directional component. An adaptive regularisation scheme is also included for stable covariance inversion. Experiments done on a high-resolution reflectance hyperspectral dataset (40 bands, 2199 × 1280 pixels) show that both TPNE and 4PNE improve noise suppression in each and every spectral band, with TPNE giving better SNR gain than the conventional next-pixel approach in 35 out of 40 bands.</w:t>
       </w:r>
     </w:p>
     <w:p>
@@ -188,7 +188,7 @@
           <w:i w:val="0"/>
           <w:sz w:val="24"/>
         </w:rPr>
-        <w:t>Principal Components (PC) transformation [1] has long been used for compression, visualisation, and enhancement of multispectral remote sensing data. However, as highlighted by Green [2] in the seminal work, PC transformation does not always produce components ordered by image quality, particularly when noise levels vary across spectral bands. To address this limitation, Green et al. introduced the Minimum Noise Fraction (MNF) transform, which orders components based on their signal-to-noise ratio (SNR) rather than variance. Due to this property, MNF became a widely used technique for noise reduction and dimensionality reduction [3] in hyperspectral image analysis [4].</w:t>
+        <w:t>Principal Components (PC) transformation [1] has long been used for compression, visualisation and enhancement of multispectral remote sensing data. However, as noted by Green [2] in the seminal work, PC transformation does not always give components ordered by image quality, especially when noise levels vary across spectral bands. To fix this problem, Green et al. introduced the Minimum Noise Fraction (MNF) transform, which orders components based on their signal-to-noise ratio (SNR) rather than variance. Because of this property, MNF became a widely used technique for noise reduction and dimensionality reduction [3] in hyperspectral image analysis [4].</w:t>
       </w:r>
     </w:p>
     <w:p>
@@ -205,7 +205,7 @@
           <w:i w:val="0"/>
           <w:sz w:val="24"/>
         </w:rPr>
-        <w:t>Despite its effectiveness, conventional MNF implementations exhibited certain practical limitations. One key issue lay in noise estimation, where noise was typically estimated using only next-pixel (horizontal) differences. This approach did not consider noise variations present in other spatial directions and ignored neighbouring pixels. As a result, the estimated noise covariance matrix did not fully capture the true spatial noise characteristics of hyperspectral images. In addition, when the spectral bands exhibited strong correlation or were nearly homogeneous, the data covariance matrix became ill-conditioned or even singular. Under such circumstances, the standard MNF eigen-decomposition could fail to converge or produce unreliable results, thereby limiting its applicability in practical hyperspectral processing workflows.</w:t>
+        <w:t>Despite being effective, conventional MNF implementations have certain practical limitations. One key issue is in noise estimation, where noise is typically calculated using only next-pixel (horizontal) differences. This approach does not account for noise variations present in other spatial directions and ignores neighbouring pixels. As a result, the estimated noise covariance matrix does not fully capture the true spatial noise characteristics of hyperspectral images. Also, when spectral bands show strong correlation or are nearly homogeneous, the data covariance matrix becomes ill-conditioned or even singular. In such cases, the standard MNF eigen-decomposition may fail to converge or produce unreliable results, which limits its use in practical hyperspectral processing.</w:t>
       </w:r>
     </w:p>
     <w:p>
@@ -222,7 +222,7 @@
           <w:i w:val="0"/>
           <w:sz w:val="24"/>
         </w:rPr>
-        <w:t>In this work, these limitations were addressed by incorporating a neighbour-pixel-based noise estimation approach, in which spatial neighbours were taken into account during noise matrix calculation. In addition, regularisation strategies were integrated to mitigate ill-conditioning and numerical instability arising from highly correlated or nearly homogeneous spectral bands. This improved noise estimation and stabilisation framework led to a more reliable noise covariance matrix and enhanced the stability and performance of the MNF transform, particularly in line-scanning-based imaging.</w:t>
+        <w:t>In this work, these problems were addressed by using a neighbour-pixel-based noise estimation approach, where spatial neighbours are taken into account during noise matrix calculation. Regularisation strategies were also added to handle ill-conditioning and numerical instability arising from highly correlated spectral bands. This improved the noise covariance matrix and enhanced the stability and performance of the MNF transform, particularly in line-scanning based imaging.</w:t>
       </w:r>
     </w:p>
     <w:p>
@@ -239,7 +239,7 @@
           <w:i w:val="0"/>
           <w:sz w:val="24"/>
         </w:rPr>
-        <w:t>To validate the proposed noise estimation technique, a comparative analysis was carried out with the conventional next-pixel method (NPNE) under both Global MNF and Line-by-Line (LBL) [5][6] processing architectures. The results demonstrated that the LBL approach consistently improved a larger number of spectral bands when a limited number of leading eigenvectors were used, while achieving comparable or better numerical improvement than the conventional MNF approach. These findings demonstrated the effectiveness of the proposed neighbour-pixel noise estimation method for hyperspectral image denoising in both batch and real-time processing [7] frameworks.</w:t>
+        <w:t>To check the usefulness of the proposed noise estimation technique, a comparison was done with the conventional next-pixel method (NPNE) under both Global MNF and Line-by-Line (LBL) [5][6] processing architectures. Results showed that the LBL approach consistently improved a larger number of spectral bands when a limited number of leading eigenvectors were used, while giving comparable or better improvement than the conventional MNF approach. These findings show the usefulness of the proposed neighbour-pixel noise estimation method for hyperspectral image denoising in both batch and real-time processing [7] frameworks.</w:t>
       </w:r>
     </w:p>
     <w:p>
@@ -272,7 +272,7 @@
           <w:i w:val="0"/>
           <w:sz w:val="24"/>
         </w:rPr>
-        <w:t>Hyperspectral imaging is a powerful technique that captures information across a large number of spectral bands, enabling detailed analysis of material properties. It has been applied in diverse areas such as remote sensing, food quality inspection, material identification, and biomedical analysis. The high spectral resolution of hyperspectral data, however, makes it highly sensitive to noise, which can arise from sensor electronics, illumination variations, and rapid data acquisition processes.</w:t>
+        <w:t>Hyperspectral imaging is a powerful technique that captures information across a large number of spectral bands, enabling detailed analysis of material properties. It has been used in diverse areas such as remote sensing, food quality inspection, material identification and biomedical analysis. The high spectral resolution of hyperspectral data, however, makes it highly sensitive to noise, which can come from sensor electronics, illumination variations and rapid data acquisition.</w:t>
       </w:r>
     </w:p>
     <w:p>
@@ -289,7 +289,7 @@
           <w:i w:val="0"/>
           <w:sz w:val="24"/>
         </w:rPr>
-        <w:t>In many practical systems, particularly push-broom scanners, hyperspectral images are acquired line by line. This acquisition mode introduces additional challenges for noise reduction, especially in real-time processing scenarios such as medical imaging [8], industrial inspection, environmental monitoring, precision agriculture. Further, military applications such as target detection [9], terrain analysis, and battlefield monitoring [10], where rapid and reliable hyperspectral analysis is critical.</w:t>
+        <w:t>In many practical systems, particularly push-broom scanners, hyperspectral images are captured line by line. This mode of acquisition introduces additional challenges for noise reduction, especially in real-time processing scenarios such as medical imaging [8], industrial inspection, environmental monitoring and precision agriculture. Military applications such as target detection [9], terrain analysis and battlefield monitoring [10] also require rapid and reliable hyperspectral analysis.</w:t>
       </w:r>
     </w:p>
     <w:p>
@@ -306,7 +306,7 @@
           <w:i w:val="0"/>
           <w:sz w:val="24"/>
         </w:rPr>
-        <w:t>To address these challenges, the Minimum Noise Fraction (MNF) transform has been widely used. MNF separates signal-dominated components from noise-dominated components by leveraging both image and noise covariance matrices. By discarding or smoothing components with low signal-to-noise ratio (SNR), MNF effectively reduces noise while preserving essential spectral information.</w:t>
+        <w:t>To handle these problems, the MNF transform has been widely used. MNF separates signal-dominated components from noise-dominated components by using both image and noise covariance matrices. By removing or smoothing components with low SNR, MNF reduces noise while keeping essential spectral information.</w:t>
       </w:r>
     </w:p>
     <w:p>
@@ -323,7 +323,7 @@
           <w:i w:val="0"/>
           <w:sz w:val="24"/>
         </w:rPr>
-        <w:t>Two main MNF processing approaches are commonly employed. Firstly, global MNF processes the entire hyperspectral cube at once, providing accurate noise-signal separation but requiring full access to the image data and significant computational resources. On the other hand, in the line-by-line (LBL) processing approach, MNF [5] performs the transformation per line, allowing real-time or streaming processing but often relying on simplified noise estimation methods, such as next-pixel (horizontal) differences, which may not fully capture spatial noise characteristics.</w:t>
+        <w:t>Two main MNF processing approaches are commonly used. First, global MNF processes the entire hyperspectral cube at once, giving accurate noise-signal separation but requiring full access to the image data and significant computational resources. On the other hand, the line-by-line (LBL) approach [5] performs the transformation per line, allowing real-time or streaming processing but often relying on simplified noise estimation methods such as next-pixel (horizontal) differences, which may not fully capture spatial noise characteristics.</w:t>
       </w:r>
     </w:p>
     <w:p>
@@ -340,7 +340,7 @@
           <w:i w:val="0"/>
           <w:sz w:val="24"/>
         </w:rPr>
-        <w:t>Conventional MNF methods also face numerical challenges. In datasets with highly correlated or nearly homogeneous spectral bands, the covariance matrix [11][12] can become ill-conditioned or singular, causing the eigen-decomposition to fail or produce unreliable results. Moreover, traditional noise estimation approaches that consider only horizontal differences often underestimate noise contributions from neighbours, limiting the effectiveness of the transform in line-scanning applications.</w:t>
+        <w:t>Conventional MNF methods also face numerical problems. In datasets with highly correlated or nearly homogeneous spectral bands, the covariance matrix [11][12] can become ill-conditioned or singular, causing the eigen-decomposition to fail or give unreliable results. Also, traditional noise estimation approaches that consider only horizontal differences often underestimate noise contributions from neighbours, which reduces the effectiveness of the transform in line-scanning applications.</w:t>
       </w:r>
     </w:p>
     <w:p>
@@ -357,7 +357,7 @@
           <w:i w:val="0"/>
           <w:sz w:val="24"/>
         </w:rPr>
-        <w:t>The present work has addressed these limitations by developing neighbour-pixel-based noise estimation techniques, which incorporate information from surrounding pixels to compute more accurate noise covariance matrices. Regularisation methods have also been applied to stabilise eigen-decomposition in cases of ill-conditioned data, improving both the reliability and performance of MNF transformations in both global and line-by-line processing scenarios.</w:t>
+        <w:t>This work addresses the above-mentioned limitations by developing neighbour-pixel-based noise estimation techniques that use information from surrounding pixels to compute more accurate noise covariance matrices. Regularisation methods are also applied to stabilise eigen-decomposition in cases of ill-conditioned data, improving both the reliability and performance of MNF in global and line-by-line processing scenarios.</w:t>
       </w:r>
     </w:p>
     <w:p>
@@ -390,7 +390,7 @@
           <w:i w:val="0"/>
           <w:sz w:val="24"/>
         </w:rPr>
-        <w:t>The Minimum Noise Fraction (MNF) transform is a widely used linear technique for separating signal and noise in hyperspectral images. Let the hyperspectral dataset be represented as a matrix Y ∈ ℝ^(B×P), where B denotes the number of spectral bands and P is the total number of pixels. The observed image is assumed to consist of the true signal S with additive noise N, expressed as</w:t>
+        <w:t>The MNF transform is a widely used linear technique for separating signal and noise in hyperspectral images. Let the hyperspectral dataset be represented as a matrix Y ∈ ℝ^(B×P), where B is the number of spectral bands and P is the total number of pixels. The observed image is assumed to consist of the true signal S with additive noise N, expressed as</w:t>
       </w:r>
     </w:p>
     <w:p>
@@ -423,7 +423,7 @@
           <w:i w:val="0"/>
           <w:sz w:val="24"/>
         </w:rPr>
-        <w:t>For MNF processing, the data are first mean-centred to obtain the zero-mean matrix Z. The transformation matrix is then derived by solving the generalised eigenvalue problem</w:t>
+        <w:t>For MNF processing, the data are first mean-centred to get the zero-mean matrix Z. The transformation matrix is then found by solving the generalised eigenvalue problem</w:t>
       </w:r>
     </w:p>
     <w:p>
@@ -456,7 +456,7 @@
           <w:i w:val="0"/>
           <w:sz w:val="24"/>
         </w:rPr>
-        <w:t>where Σ and Σ_N denote the image covariance matrix and noise covariance matrix, respectively. The resulting eigenvectors form the MNF basis, and the components are automatically ordered from high to low signal-to-noise ratio (SNR). Thus, the first few components contain most of the useful spectral information, whereas the later components are dominated by noise.</w:t>
+        <w:t>where Σ and Σ_N are the image covariance matrix and noise covariance matrix respectively. The resulting eigenvectors form the MNF basis, and the components are ordered from high to low SNR. So the first few components contain most of the useful spectral information, whereas the later components are dominated by noise.</w:t>
       </w:r>
     </w:p>
     <w:p>
@@ -473,7 +473,7 @@
           <w:i w:val="0"/>
           <w:sz w:val="24"/>
         </w:rPr>
-        <w:t>A denoised reconstruction is obtained by retaining only the first r high-SNR components. The corresponding inverse transform can be written as</w:t>
+        <w:t>A denoised reconstruction is obtained by keeping only the first r high-SNR components. The inverse transform is written as</w:t>
       </w:r>
     </w:p>
     <w:p>
@@ -506,7 +506,7 @@
           <w:i w:val="0"/>
           <w:sz w:val="24"/>
         </w:rPr>
-        <w:t>where A is the forward MNF transform matrix and R is a diagonal matrix that preserves only the selected components. In practice, the noise covariance Σ_N is estimated using simple pixel differences under the assumption that neighbouring pixels are spatially correlated. This is given by</w:t>
+        <w:t>where A is the forward MNF transform matrix and R is a diagonal matrix that keeps only the selected components. In practice, the noise covariance Σ_N is estimated using simple pixel differences under the assumption that neighbouring pixels are spatially correlated. This is given by</w:t>
       </w:r>
     </w:p>
     <w:p>
@@ -539,7 +539,7 @@
           <w:i w:val="0"/>
           <w:sz w:val="24"/>
         </w:rPr>
-        <w:t>This is referred to as next pixel noise estimation (NPNE) in the present paper.</w:t>
+        <w:t>This is referred to as next pixel noise estimation (NPNE) in this paper.</w:t>
       </w:r>
     </w:p>
     <w:p>
@@ -572,7 +572,7 @@
           <w:i w:val="0"/>
           <w:sz w:val="24"/>
         </w:rPr>
-        <w:t>In conventional MNF implementations, noise was typically estimated using only horizontal differences between neighbouring pixels, which did not fully capture the spatial variability in hyperspectral images. Noise can arise from multiple sources, including sensor electronics, illumination variations, sensor or scene motion, fast data acquisition, and environmental factors, often causing variations in multiple spatial directions.</w:t>
+        <w:t>In conventional MNF implementations, noise is typically estimated using only horizontal differences between neighbouring pixels. This does not fully capture the spatial variability in hyperspectral images. Noise can come from multiple sources including sensor electronics, illumination variations, sensor or scene motion, fast data acquisition and environmental factors, all of which cause variations in multiple spatial directions.</w:t>
       </w:r>
     </w:p>
     <w:p>
@@ -589,7 +589,7 @@
           <w:i w:val="0"/>
           <w:sz w:val="24"/>
         </w:rPr>
-        <w:t>To address this, the present work proposes two multi-directional noise estimation methods: Three-Pixel Noise Estimation (TPNE) and Four-Pixel Noise Estimation (4PNE). Both methods incorporate horizontal, vertical, and diagonal differences. Consecutive lines in push-broom scanners naturally provide vertical neighbours, which are used to improve noise estimation accuracy. By combining differences along multiple directions, the estimated noise better represents true spatial variability and produces a more stable noise covariance matrix, which is critical for regularised MNF transformations, especially in datasets with highly correlated or nearly homogeneous spectral bands.</w:t>
+        <w:t>To handle this, the present work proposes two multi-directional noise estimation methods, viz. Three-Pixel Noise Estimation (TPNE) and Four-Pixel Noise Estimation (4PNE). Both methods use horizontal, vertical and diagonal differences. Consecutive lines in push-broom scanners naturally provide vertical neighbours, which help improve noise estimation accuracy. By combining differences along multiple directions, the estimated noise better represents true spatial variability and produces a more stable noise covariance matrix. This is critical for regularised MNF transformations, especially in datasets with highly correlated or nearly homogeneous spectral bands.</w:t>
       </w:r>
     </w:p>
     <w:p>
@@ -606,7 +606,7 @@
           <w:i w:val="0"/>
           <w:sz w:val="24"/>
         </w:rPr>
-        <w:t>In the Line-by-Line (LBL) processing architecture, future lines are unavailable during processing. Both methods therefore use the previously acquired line to compute vertical and diagonal differences, enabling integration into the LBL framework while maintaining real-time processing capabilities and providing more accurate noise estimation than horizontal-only approaches.</w:t>
+        <w:t>In the Line-by-Line (LBL) processing architecture, future lines are not available during processing. Both methods therefore use the previously acquired line to compute vertical and diagonal differences. This allows integration into the LBL framework while keeping real-time processing capability and giving better noise estimation than horizontal-only approaches.</w:t>
       </w:r>
     </w:p>
     <w:p>
@@ -639,7 +639,7 @@
           <w:i w:val="0"/>
           <w:sz w:val="24"/>
         </w:rPr>
-        <w:t>The proposed TPNE method follows the same MNF theoretical framework described in Section 3. The signal model, generalised eigenvalue formulation, and reconstruction process remain unchanged and are governed by Equations (1)–(3). The only modification introduced by the proposed approach lies in the estimation of the noise matrix, which directly influences the noise covariance matrix used in the MNF transform. The estimation of the noise covariance matrix is presented in Algorithm 1.</w:t>
+        <w:t>The proposed TPNE method follows the same MNF theoretical framework described in Section 3. The signal model, generalised eigenvalue formulation and reconstruction process remain unchanged and are governed by Equations (1)–(3). The only change introduced by the proposed approach is in the estimation of the noise matrix, which directly affects the noise covariance matrix used in the MNF transform. Algorithm 1 presents the TPNE noise estimation procedure.</w:t>
       </w:r>
     </w:p>
     <w:p>
@@ -932,7 +932,7 @@
           <w:i w:val="0"/>
           <w:sz w:val="24"/>
         </w:rPr>
-        <w:t>The Four-Pixel Noise Estimation (4PNE) method extends TPNE by incorporating a fourth directional component: the below-horizontal difference. In addition to the horizontal (h), vertical (v), and diagonal (d) differences used in TPNE, 4PNE includes the below-horizontal difference (bh), which computes pixel differences along the row immediately below the current line. The 4PNE estimate is defined as:</w:t>
+        <w:t>The 4PNE method extends TPNE by adding a fourth directional component, viz. the below-horizontal difference. Apart from the horizontal (h), vertical (v) and diagonal (d) differences used in TPNE, 4PNE also includes the below-horizontal difference (bh), which computes pixel differences along the row just below the current line. The 4PNE estimate is defined as:</w:t>
       </w:r>
     </w:p>
     <w:p>
@@ -965,7 +965,7 @@
           <w:i w:val="0"/>
           <w:sz w:val="24"/>
         </w:rPr>
-        <w:t>where h = Y[l][:, 0:S−1] − Y[l][:, 1:S] is the horizontal difference, v = Y[l][:, 0:S−1] − Y[l+1][:, 0:S−1] is the vertical difference, bh = Y[l+1][:, 0:S−1] − Y[l+1][:, 1:S] is the below-horizontal difference, and d = Y[l][:, 0:S−1] − Y[l+1][:, 1:S] is the diagonal difference. By averaging four independent directional noise samples, 4PNE produces a more isotropic noise estimate that is less sensitive to any single directional artefact.</w:t>
+        <w:t>where h = Y[l][:, 0:S−1] − Y[l][:, 1:S] is the horizontal difference, v = Y[l][:, 0:S−1] − Y[l+1][:, 0:S−1] is the vertical difference, bh = Y[l+1][:, 0:S−1] − Y[l+1][:, 1:S] is the below-horizontal difference, and d = Y[l][:, 0:S−1] − Y[l+1][:, 1:S] is the diagonal difference. By averaging four independent directional noise samples, 4PNE gives a more isotropic noise estimate that is less sensitive to noise in any single direction.</w:t>
       </w:r>
     </w:p>
     <w:p>
@@ -998,7 +998,7 @@
           <w:i w:val="0"/>
           <w:sz w:val="24"/>
         </w:rPr>
-        <w:t>In the present study, the quantitative metrics employed to assess the quality of individual spectral bands include band variance, signal-to-noise ratio (SNR), structural similarity index (SSIM), and peak signal-to-noise ratio (PSNR). These metrics are utilised as no ground truth data is required for analysis.</w:t>
+        <w:t>In this work, the metrics used to check the quality of individual spectral bands are band variance, signal-to-noise ratio (SNR), structural similarity index (SSIM) and peak signal-to-noise ratio (PSNR). These metrics are useful as no ground truth data is needed.</w:t>
       </w:r>
     </w:p>
     <w:p>
@@ -1015,7 +1015,7 @@
           <w:i w:val="0"/>
           <w:sz w:val="24"/>
         </w:rPr>
-        <w:t>Let B denote the total number of spectral bands and N denote the number of spatial samples (pixels) in each of the bands. Let x_b(i) represent the reference signal value of the i-th pixel in band b, and x̂_b(i) represent the corresponding reconstructed or estimated value.</w:t>
+        <w:t>Let B be the total number of spectral bands and N be the number of spatial samples (pixels) in each band. Let x_b(i) be the reference signal value of the i-th pixel in band b, and x̂_b(i) be the corresponding reconstructed value.</w:t>
       </w:r>
     </w:p>
     <w:p>
@@ -1081,7 +1081,7 @@
           <w:i w:val="0"/>
           <w:sz w:val="24"/>
         </w:rPr>
-        <w:t>and the corresponding standard deviation is σ_b = √(σ²_b). Under the additive noise assumption (Equation 1), the observed band variance satisfies</w:t>
+        <w:t>and the corresponding standard deviation is σ_b = √(σ²_b). Under the additive noise assumption given by Equation (1), the observed band variance satisfies</w:t>
       </w:r>
     </w:p>
     <w:p>
@@ -1114,7 +1114,7 @@
           <w:i w:val="0"/>
           <w:sz w:val="24"/>
         </w:rPr>
-        <w:t>After noise removal, the variance of the denoised band decreases due to suppression of the noise component, while the underlying signal variance is largely preserved.</w:t>
+        <w:t>After noise removal, the variance of the denoised band decreases as the noise component is suppressed, while the signal variance is largely preserved.</w:t>
       </w:r>
     </w:p>
     <w:p>
@@ -1147,7 +1147,7 @@
           <w:i w:val="0"/>
           <w:sz w:val="24"/>
         </w:rPr>
-        <w:t>The band-wise Signal-to-Noise Ratio (SNR) is defined as the ratio of the mean value of the band to its standard deviation:</w:t>
+        <w:t>The band-wise SNR is defined as the ratio of the mean value of the band to its standard deviation:</w:t>
       </w:r>
     </w:p>
     <w:p>
@@ -1196,7 +1196,7 @@
           <w:i w:val="0"/>
           <w:sz w:val="24"/>
         </w:rPr>
-        <w:t>The Structural Similarity Index (SSIM) quantifies the perceived similarity between the original band image and the MNF-reconstructed band image. SSIM is computed per spectral band on the two-dimensional spatial slice (lines × samples) and then averaged across all bands. A value of 1.0 denotes perfect structural fidelity.</w:t>
+        <w:t>SSIM measures the perceived similarity between the original band image and the MNF-reconstructed band image. It is computed per spectral band on the two-dimensional spatial slice (lines × samples) and then averaged across all bands. A value of 1.0 means perfect structural similarity.</w:t>
       </w:r>
     </w:p>
     <w:p>
@@ -1229,7 +1229,7 @@
           <w:i w:val="0"/>
           <w:sz w:val="24"/>
         </w:rPr>
-        <w:t>The Peak Signal-to-Noise Ratio (PSNR), expressed in decibels, measures reconstruction fidelity relative to the dynamic range of the original image:</w:t>
+        <w:t>PSNR, expressed in decibels, measures reconstruction quality relative to the dynamic range of the original image:</w:t>
       </w:r>
     </w:p>
     <w:p>
@@ -1262,7 +1262,7 @@
           <w:i w:val="0"/>
           <w:sz w:val="24"/>
         </w:rPr>
-        <w:t>where RMSE denotes the root-mean-squared error between the original and reconstructed images. A higher PSNR value indicates that the reconstructed image is numerically closer to the original.</w:t>
+        <w:t>where RMSE is the root-mean-squared error between the original and reconstructed images. Higher PSNR means the reconstructed image is numerically closer to the original.</w:t>
       </w:r>
     </w:p>
     <w:p>
@@ -1311,7 +1311,7 @@
           <w:i w:val="0"/>
           <w:sz w:val="24"/>
         </w:rPr>
-        <w:t>The experiments were conducted on a high-resolution airborne reflectance hyperspectral dataset comprising 40 contiguous spectral bands. The imagery was provided on a spatial grid with a pixel size of 15 cm (0.15 m × 0.15 m), containing 2199 scan lines and 1280 samples per line. The dataset is representative of real-world push-broom scanner imagery and presents conditions typical of airborne remote sensing missions, including spatially correlated noise and heterogeneous land cover.</w:t>
+        <w:t>Experiments were done on a high-resolution airborne reflectance hyperspectral dataset having 40 contiguous spectral bands. The imagery was provided on a spatial grid with a pixel size of 15 cm (0.15 m × 0.15 m), containing 2199 scan lines and 1280 samples per line. This dataset is representative of real-world push-broom scanner imagery and has conditions typical of airborne remote sensing missions, including spatially correlated noise and heterogeneous land cover.</w:t>
       </w:r>
     </w:p>
     <w:p>
@@ -1344,7 +1344,7 @@
           <w:i w:val="0"/>
           <w:sz w:val="24"/>
         </w:rPr>
-        <w:t>All experiments were conducted on a system equipped with an Intel® Core™ i5-9300H processor operating at 2.40 GHz and 8 GB of RAM. Computation and visualisation tasks were supported by an NVIDIA GeForce GTX 1050 GPU (cuBLAS) [13]. The system ran a 64-bit Ubuntu 22.04 LTS operating system.</w:t>
+        <w:t>All experiments were done on a system having an Intel® Core™ i5-9300H processor operating at 2.40 GHz and 8 GB of RAM. Computation and visualisation tasks were supported by an NVIDIA GeForce GTX 1050 GPU (cuBLAS) [13]. The system ran a 64-bit Ubuntu 22.04 LTS operating system.</w:t>
       </w:r>
     </w:p>
     <w:p>
@@ -1377,7 +1377,7 @@
           <w:i w:val="0"/>
           <w:sz w:val="24"/>
         </w:rPr>
-        <w:t>The MNF library was implemented in Python 3.10, using NumPy for array operations, SciPy for the generalised eigenvalue decomposition (scipy.linalg.eigh), and rasterio for GeoTIFF input and output. The library supports both global (whole-image) MNF and line-by-line MNF processing modes, configurable through a unified configuration interface. All three noise estimators — NPNE, TPNE, and 4PNE — are implemented as fully vectorised NumPy operations. Tikhonov regularisation and a Cholesky whitening fallback are applied automatically in the line-by-line mode when the covariance matrix becomes nearly singular.</w:t>
+        <w:t>The MNF library was implemented in Python 3.10, using NumPy for array operations, SciPy for the generalised eigenvalue decomposition (scipy.linalg.eigh) and rasterio for GeoTIFF input and output. The library supports both global MNF and line-by-line MNF processing modes. All three noise estimators, viz. NPNE, TPNE and 4PNE, are implemented as fully vectorised NumPy operations. Tikhonov regularisation and a Cholesky whitening fallback are applied automatically in the line-by-line mode when the covariance matrix becomes nearly singular.</w:t>
       </w:r>
     </w:p>
     <w:p>
@@ -1394,7 +1394,7 @@
           <w:i w:val="0"/>
           <w:sz w:val="24"/>
         </w:rPr>
-        <w:t>For each experiment, the MNF transform was applied in the forward-then-inverse direction. The inverse transform retained the top 20% of eigenvectors, corresponding to the 8 highest-SNR components out of 40 spectral bands.</w:t>
+        <w:t>For each experiment, the MNF transform was applied in the forward-then-inverse direction. The inverse transform kept the top 20% of eigenvectors, which corresponds to the 8 highest-SNR components out of 40 spectral bands.</w:t>
       </w:r>
     </w:p>
     <w:p>
@@ -1427,7 +1427,7 @@
           <w:i w:val="0"/>
           <w:sz w:val="24"/>
         </w:rPr>
-        <w:t>To validate the effectiveness of the proposed noise estimation techniques, a detailed comparative analysis was performed between the TPNE method, the 4PNE method, and the conventional next-pixel approach (NPNE). Both noise calculation methods were evaluated using two different processing architectures: the Global MNF approach, in which the entire image was processed simultaneously using global statistics, and the line-by-line (LBL) approach, in which statistical parameters were updated incrementally as each line of the image was processed, making it suitable for real-time or streaming applications.</w:t>
+        <w:t>To check the usefulness of the proposed noise estimation techniques, a detailed comparison was done between the TPNE method, the 4PNE method and the conventional next-pixel approach (NPNE). Both noise calculation methods were tested using two different processing architectures: the Global MNF approach, where the entire image is processed at once using global statistics, and the line-by-line (LBL) approach, where statistical parameters are updated incrementally as each line is processed, making it suitable for real-time or streaming applications.</w:t>
       </w:r>
     </w:p>
     <w:p>
@@ -1460,7 +1460,7 @@
           <w:i w:val="0"/>
           <w:sz w:val="24"/>
         </w:rPr>
-        <w:t>Performance comparison was first analysed on the basis of noise estimation variance across selected bands under both LBL and Global MNF architectures, varying the number of inverse bands from 2 to 4. Table 1 presents the noise estimation variance for Band 30 and Band 33 using the LBL approach, and Table 2 presents the corresponding values for the Global MNF approach.</w:t>
+        <w:t>Performance was first compared on the basis of noise estimation variance across selected bands under both LBL and Global MNF architectures, by varying the number of inverse bands from 2 to 4. Table 1 shows the noise estimation variance for Band 30 and Band 33 using the LBL approach, and Table 2 shows the same for the Global MNF approach.</w:t>
       </w:r>
     </w:p>
     <w:p>
@@ -2751,7 +2751,7 @@
           <w:i w:val="0"/>
           <w:sz w:val="24"/>
         </w:rPr>
-        <w:t>From Tables 1 and 2, it is observed that the TPNE method consistently produces lower noise variance than the conventional next-pixel method across all bands and inverse band configurations. This reduction is evident for both Line-by-Line (LBL) and Global MNF processing, indicating that the TPNE approach provides a more reliable and stable noise estimate by better suppressing spatially correlated signal components.</w:t>
+        <w:t>From the above tables, it can be seen that the TPNE method gives lower noise variance than the conventional next-pixel method across all bands and inverse band configurations. This is true for both LBL and Global MNF processing, which shows that the TPNE approach gives a more reliable and stable noise estimate by better suppressing spatially correlated signal components.</w:t>
       </w:r>
     </w:p>
     <w:p>
@@ -2768,7 +2768,7 @@
           <w:i w:val="0"/>
           <w:sz w:val="24"/>
         </w:rPr>
-        <w:t>Performance comparison was further analysed on the basis of the number of bands that showed improvement. When the first two eigenvectors were used as inverse bands, the LBL approach demonstrated improvements in 35 spectral bands. When the number of inverse bands was increased to three, the performance of the LBL approach improved further, with enhancements observed in 39 bands. In this configuration, the LBL approach slightly outperformed the global MNF approach, which showed improvements in 37 bands. When the first four eigenvectors were employed, the LBL approach maintained consistent performance, continuing to improve 39 bands. In contrast, the global MNF approach exhibited stable behaviour, with improvements observed in 38 bands.</w:t>
+        <w:t>Performance was further compared on the basis of the number of bands that showed improvement. When the first two eigenvectors were used as inverse bands, the LBL approach improved 35 spectral bands. When the number of inverse bands was increased to three, the LBL approach improved further, with enhancements seen in 39 bands. In this configuration, LBL slightly outperformed the global MNF approach, which showed improvements in 37 bands. When the first four eigenvectors were used, the LBL approach continued to improve 39 bands, while the global MNF approach showed stable behaviour with improvements in 38 bands.</w:t>
       </w:r>
     </w:p>
     <w:p>
@@ -2785,7 +2785,7 @@
           <w:i w:val="0"/>
           <w:sz w:val="24"/>
         </w:rPr>
-        <w:t>In addition to the number of improved bands, the numerical improvement values were also examined and found to follow a similar trend. For Band 30, when the first two eigenvectors were used, the LBL approach achieved an improvement of 7.53%, which was higher than the improvement of 5.97% obtained using the global MNF approach. When the first three eigenvectors were considered, the improvement produced by the LBL approach decreased to 4.66%, while the improvement obtained using the global MNF approach remained nearly unchanged at 5.95%. Similarly, for Band 33, using the first two eigenvectors, the LBL approach resulted in an improvement of 5.53%, whereas the global MNF approach achieved a substantially lower improvement of 1.80%.</w:t>
+        <w:t>The numerical improvement values also follow a similar trend. For Band 30, when the first two eigenvectors were used, the LBL approach gave an improvement of 7.53%, which is higher than the 5.97% improvement from the global MNF approach. When three eigenvectors were used, the LBL improvement decreased to 4.66% while the global MNF improvement stayed nearly unchanged at 5.95%. For Band 33, using two eigenvectors, the LBL approach gave an improvement of 5.53% whereas the global MNF approach achieved only 1.80%.</w:t>
       </w:r>
     </w:p>
     <w:p>
@@ -2801,7 +2801,7 @@
           <w:i w:val="0"/>
           <w:sz w:val="24"/>
         </w:rPr>
-        <w:t>7.2  Per-Band SNR, SSIM, and PSNR Analysis</w:t>
+        <w:t>7.2  Per-Band SNR, SSIM and PSNR Analysis</w:t>
       </w:r>
     </w:p>
     <w:p>
@@ -2818,7 +2818,7 @@
           <w:i w:val="0"/>
           <w:sz w:val="24"/>
         </w:rPr>
-        <w:t>A comprehensive per-band analysis was conducted using the Global MNF architecture with 20% of bands retained in the inverse transform (8 of 40 bands). For each of the 40 spectral bands, SNR before and after MNF, SNR gain, SSIM between the original and reconstructed band, and PSNR were computed for all three noise estimation methods. Table 3 presents the overall summary across all bands.</w:t>
+        <w:t>A per-band analysis was done using the Global MNF architecture with 20% of bands kept in the inverse transform (8 out of 40 bands). For each of the forty spectral bands, SNR before and after MNF, SNR gain, SSIM between the original and reconstructed band, and PSNR were calculated for all three noise estimation methods. Table 3 presents the overall summary across all bands.</w:t>
       </w:r>
     </w:p>
     <w:p>
@@ -3083,9 +3083,7 @@
                 <w:i w:val="0"/>
                 <w:sz w:val="22"/>
               </w:rPr>
-              <w:t>40 / 40</w:t>
-              <w:br/>
-              <w:t>(100%)</w:t>
+              <w:t>40/40 (100%)</w:t>
             </w:r>
           </w:p>
         </w:tc>
@@ -3255,9 +3253,7 @@
                 <w:i w:val="0"/>
                 <w:sz w:val="22"/>
               </w:rPr>
-              <w:t>40 / 40</w:t>
-              <w:br/>
-              <w:t>(100%)</w:t>
+              <w:t>40/40 (100%)</w:t>
             </w:r>
           </w:p>
         </w:tc>
@@ -3427,9 +3423,7 @@
                 <w:i w:val="0"/>
                 <w:sz w:val="22"/>
               </w:rPr>
-              <w:t>40 / 40</w:t>
-              <w:br/>
-              <w:t>(100%)</w:t>
+              <w:t>40/40 (100%)</w:t>
             </w:r>
           </w:p>
         </w:tc>
@@ -3576,7 +3570,7 @@
           <w:i w:val="0"/>
           <w:sz w:val="24"/>
         </w:rPr>
-        <w:t>All three methods enhanced all 40 spectral bands (SNR gain &gt; 0 in 100% of bands). TPNE outperforms NPNE on raw SNR gain in 35 of 40 bands, and 4PNE does so in 33 of 40 bands. This demonstrates that multi-directional noise estimation consistently captures noise structure more accurately across nearly the full spectral range.</w:t>
+        <w:t>It can be seen from Table 3 that all three methods improve each and every one of the 40 spectral bands. TPNE gives better SNR gain than NPNE in 35 out of 40 bands, and 4PNE does so in 33 out of 40 bands. This shows that multi-directional noise estimation captures the noise structure more accurately across nearly the full spectral range.</w:t>
       </w:r>
     </w:p>
     <w:p>
@@ -3593,7 +3587,7 @@
           <w:i w:val="0"/>
           <w:sz w:val="24"/>
         </w:rPr>
-        <w:t>NPNE achieves marginally higher mean SSIM (0.9438 vs 0.9429 for TPNE, 0.9434 for 4PNE) and higher mean PSNR (43.98 dB vs 43.62 dB and 43.80 dB). This reflects a known trade-off inherent to multi-directional noise estimation: by building a more accurate model of the noise covariance, TPNE and 4PNE separate noise from signal more aggressively, which increases SNR at the expense of a small increase in per-pixel deviation from the original noisy image. In the context of remote sensing denoising, the SNR gain metric is the primary figure of merit, since the goal is to suppress sensor noise rather than to reconstruct the original noisy measurement.</w:t>
+        <w:t>NPNE gives slightly higher mean SSIM (0.9438 vs 0.9429 for TPNE and 0.9434 for 4PNE) and higher mean PSNR (43.98 dB vs 43.62 dB and 43.80 dB). This is because multi-directional noise estimation separates noise from signal more aggressively, which increases SNR but causes a small increase in per-pixel difference from the original noisy image. In remote sensing denoising, SNR gain is the primary metric of interest since the goal is to suppress sensor noise, not to reconstruct the original noisy measurement.</w:t>
       </w:r>
     </w:p>
     <w:p>
@@ -3610,7 +3604,7 @@
           <w:i w:val="0"/>
           <w:sz w:val="24"/>
         </w:rPr>
-        <w:t>Table 4 provides a detailed view of selected representative spectral bands, illustrating the band-by-band SNR gain for each method. Bands 30 and 33 — identified in the noise variance analysis as characteristic bands — are highlighted.</w:t>
+        <w:t>Table 4 gives a detailed view of selected spectral bands, showing the per-band SNR gain for each method. Bands 30 and 33, which were also analysed in the noise variance study above, are highlighted.</w:t>
       </w:r>
     </w:p>
     <w:p>
@@ -3626,7 +3620,7 @@
           <w:i/>
           <w:sz w:val="22"/>
         </w:rPr>
-        <w:t>Table 4: Per-band SNR gain, SSIM, and PSNR for selected bands (reflectance dataset).</w:t>
+        <w:t>Table 4: Per-band SNR gain, SSIM and PSNR for selected bands (reflectance dataset).</w:t>
       </w:r>
     </w:p>
     <w:tbl>
@@ -3689,7 +3683,9 @@
                 <w:i w:val="0"/>
                 <w:sz w:val="22"/>
               </w:rPr>
-              <w:t>NPNE SNR Gain</w:t>
+              <w:t>NPNE SNR</w:t>
+              <w:br/>
+              <w:t>Gain</w:t>
             </w:r>
           </w:p>
         </w:tc>
@@ -3711,7 +3707,9 @@
                 <w:i w:val="0"/>
                 <w:sz w:val="22"/>
               </w:rPr>
-              <w:t>TPNE SNR Gain</w:t>
+              <w:t>TPNE SNR</w:t>
+              <w:br/>
+              <w:t>Gain</w:t>
             </w:r>
           </w:p>
         </w:tc>
@@ -3733,7 +3731,9 @@
                 <w:i w:val="0"/>
                 <w:sz w:val="22"/>
               </w:rPr>
-              <w:t>4PNE SNR Gain</w:t>
+              <w:t>4PNE SNR</w:t>
+              <w:br/>
+              <w:t>Gain</w:t>
             </w:r>
           </w:p>
         </w:tc>
@@ -3755,7 +3755,9 @@
                 <w:i w:val="0"/>
                 <w:sz w:val="22"/>
               </w:rPr>
-              <w:t>NPNE SSIM</w:t>
+              <w:t>NPNE</w:t>
+              <w:br/>
+              <w:t>SSIM</w:t>
             </w:r>
           </w:p>
         </w:tc>
@@ -3777,7 +3779,9 @@
                 <w:i w:val="0"/>
                 <w:sz w:val="22"/>
               </w:rPr>
-              <w:t>TPNE SSIM</w:t>
+              <w:t>TPNE</w:t>
+              <w:br/>
+              <w:t>SSIM</w:t>
             </w:r>
           </w:p>
         </w:tc>
@@ -3799,7 +3803,9 @@
                 <w:i w:val="0"/>
                 <w:sz w:val="22"/>
               </w:rPr>
-              <w:t>4PNE SSIM</w:t>
+              <w:t>4PNE</w:t>
+              <w:br/>
+              <w:t>SSIM</w:t>
             </w:r>
           </w:p>
         </w:tc>
@@ -3821,7 +3827,9 @@
                 <w:i w:val="0"/>
                 <w:sz w:val="22"/>
               </w:rPr>
-              <w:t>NPNE PSNR (dB)</w:t>
+              <w:t>NPNE</w:t>
+              <w:br/>
+              <w:t>PSNR (dB)</w:t>
             </w:r>
           </w:p>
         </w:tc>
@@ -3843,7 +3851,9 @@
                 <w:i w:val="0"/>
                 <w:sz w:val="22"/>
               </w:rPr>
-              <w:t>TPNE PSNR (dB)</w:t>
+              <w:t>TPNE</w:t>
+              <w:br/>
+              <w:t>PSNR (dB)</w:t>
             </w:r>
           </w:p>
         </w:tc>
@@ -3865,7 +3875,9 @@
                 <w:i w:val="0"/>
                 <w:sz w:val="22"/>
               </w:rPr>
-              <w:t>4PNE PSNR (dB)</w:t>
+              <w:t>4PNE</w:t>
+              <w:br/>
+              <w:t>PSNR (dB)</w:t>
             </w:r>
           </w:p>
         </w:tc>
@@ -5370,7 +5382,7 @@
           <w:i w:val="0"/>
           <w:sz w:val="24"/>
         </w:rPr>
-        <w:t>For Band 30, all three methods produce very similar SNR gain (approximately +0.90), with TPNE (+0.9033) and 4PNE (+0.9040) marginally exceeding NPNE (+0.8997). The SSIM values are nearly identical across methods (≈0.971), confirming that structural fidelity is preserved. For Band 33, NPNE achieves a slightly higher SNR gain (+0.8152) compared with TPNE (+0.8066) and 4PNE (+0.8068), while SSIM remains consistent across all three methods (≈0.935). These results are consistent with the noise variance analysis in Tables 1 and 2, where Band 33 showed mixed behaviour across methods for higher inverse band counts.</w:t>
+        <w:t>For Band 30, all three methods give very similar SNR gain (approximately +0.90), with TPNE (+0.9033) and 4PNE (+0.9040) slightly exceeding NPNE (+0.8997). SSIM values are nearly identical across methods (≈0.971), confirming that structural fidelity is maintained. For Band 33, NPNE gives slightly higher SNR gain (+0.8152) compared to TPNE (+0.8066) and 4PNE (+0.8068), while SSIM stays consistent across all three methods (≈0.935). This is consistent with the noise variance results in Tables 1 and 2, where Band 33 showed mixed behaviour for higher inverse band counts.</w:t>
       </w:r>
     </w:p>
     <w:p>
@@ -5387,7 +5399,7 @@
           <w:i w:val="0"/>
           <w:sz w:val="24"/>
         </w:rPr>
-        <w:t>Bands 24 and 25 show the largest absolute SNR gains (approximately +0.023 and +0.030 respectively), which corresponds to the region of highest noise content in the reflectance dataset. In this region, TPNE and 4PNE provide marginally higher SNR gains than NPNE, while SSIM and PSNR values remain comparable across methods. Band 30 exhibits the highest absolute SNR gain in the dataset (+0.90), reflecting a band with high initial noise fraction that benefits strongly from MNF denoising regardless of the noise estimation method employed.</w:t>
+        <w:t>Bands 24 and 25 show the largest absolute SNR gains (approximately +0.023 and +0.030 respectively), corresponding to the region of highest noise content in the reflectance dataset. In this region, TPNE and 4PNE give marginally higher SNR gains than NPNE, while SSIM and PSNR values remain similar across methods. Band 30 shows the highest absolute SNR gain in the dataset (+0.90), which indicates a band with high initial noise fraction that benefits strongly from MNF denoising regardless of the noise estimation method used.</w:t>
       </w:r>
     </w:p>
     <w:p>
@@ -5404,7 +5416,7 @@
           <w:i w:val="0"/>
           <w:sz w:val="24"/>
         </w:rPr>
-        <w:t>The visual analysis of reconstructed band images further confirms these findings. The TPNE approach exhibits visibly improved noise suppression and enhanced structural clarity compared to the next-pixel method, while better preserving spatial details in both Band 30 and Band 33.</w:t>
+        <w:t>The visual analysis of reconstructed band images further confirms these results. The TPNE approach shows visibly improved noise suppression and better structural clarity compared to the next-pixel method, while spatial details are better preserved in both Band 30 and Band 33.</w:t>
       </w:r>
     </w:p>
     <w:p>
@@ -5437,7 +5449,7 @@
           <w:i w:val="0"/>
           <w:sz w:val="24"/>
         </w:rPr>
-        <w:t>The present study proposes an improved minimum noise fraction transform technique for hyperspectral image denoising. Although Global MNF and Line-by-Line (LBL) architectures were already well established, the main contribution of the present work is the introduction of a three-pixel-based noise estimation (TPNE) method, which significantly enhanced the performance in reducing noise while maintaining the spectral information. Unlike traditional approaches that considered only horizontally adjacent pixels, the proposed method also includes vertical and diagonal pixel relationships, which help capture the spatial noise structure more accurately and reduce noise more effectively. A further extension, the Four-Pixel Noise Estimation (4PNE) method, additionally incorporates the below-horizontal directional difference, providing a more isotropic noise estimate.</w:t>
+        <w:t>The present study proposes an improved minimum noise fraction transform technique for hyperspectral image denoising. Although Global MNF and Line-by-Line (LBL) architectures were already well established, the main contribution of this work is the introduction of three-pixel-based noise estimation (TPNE), which significantly improves noise reduction while keeping the spectral information. Unlike traditional approaches that used only horizontally adjacent pixels, the proposed method also includes vertical and diagonal pixel relationships, which help capture the spatial noise structure more accurately. A further extension, viz. the Four-Pixel Noise Estimation (4PNE) method, adds the below-horizontal directional difference to give a more isotropic noise estimate.</w:t>
       </w:r>
     </w:p>
     <w:p>
@@ -5454,7 +5466,7 @@
           <w:i w:val="0"/>
           <w:sz w:val="24"/>
         </w:rPr>
-        <w:t>The proposed noise estimation methods were validated by integrating them into both Global MNF and LBL architectures and evaluating them on a high-resolution reflectance hyperspectral dataset (40 bands, 2199 × 1280 pixels). Experimental results demonstrate that both TPNE and 4PNE enhance all 40 spectral bands (100% of bands show positive SNR gain). TPNE outperforms NPNE on SNR gain in 35 of 40 bands, and 4PNE does so in 33 of 40 bands. The mean SSIM and PSNR remain competitive across all methods, confirming that noise suppression improvements do not come at the cost of significant structural degradation.</w:t>
+        <w:t>The proposed methods were tested on a high-resolution reflectance hyperspectral dataset (40 bands, 2199 × 1280 pixels). Results show that both TPNE and 4PNE improve all forty spectral bands. TPNE gives better SNR gain than NPNE in 35 of 40 bands, and 4PNE does so in 33 of 40 bands. Mean SSIM and PSNR values remain competitive across all methods, which confirms that the noise suppression improvements do not cause significant structural degradation.</w:t>
       </w:r>
     </w:p>
     <w:p>
@@ -5471,7 +5483,7 @@
           <w:i w:val="0"/>
           <w:sz w:val="24"/>
         </w:rPr>
-        <w:t>Experimental results demonstrate that the suggested method reduces the estimated noise while improving the signal quality, with more noticeable performance improvements observed in the LBL framework, where accurate noise estimation was important for real-time processing. These findings confirm that multi-directional noise estimation provides more consistent and larger SNR improvements, particularly in spectral bands with high noise fraction where the neighbour-pixel covariance information has the greatest discriminating power.</w:t>
+        <w:t>More noticeable improvements were seen in the LBL framework, where accurate noise estimation is important for real-time processing. These results confirm that multi-directional noise estimation gives more consistent and larger SNR improvements, particularly in spectral bands with high noise fraction where the neighbour-pixel covariance information has the greatest effect.</w:t>
       </w:r>
     </w:p>
     <w:p>
@@ -5504,7 +5516,7 @@
           <w:i w:val="0"/>
           <w:sz w:val="24"/>
         </w:rPr>
-        <w:t>Authors would like to express their gratitude to Dr. Manvendra Singh, IRDE, DRDO, Dehradun and his team for providing the hyperspectral dataset. Further, the reviewers' insightful comments are greatly appreciated, and the authors would like to express their gratitude. Furthermore, authors acknowledge the fair and responsible use of OpenAI's ChatGPT for language refinement and grammar checking.</w:t>
+        <w:t>Authors would like to express their gratitude to Dr. Manvendra Singh, IRDE, DRDO, Dehradun and his team for providing the hyperspectral dataset. The reviewers' insightful comments are also greatly appreciated. Further, authors acknowledge the fair and responsible use of OpenAI's ChatGPT for language refinement and grammar checking.</w:t>
       </w:r>
     </w:p>
     <w:p>
@@ -5520,7 +5532,7 @@
           <w:i w:val="0"/>
           <w:sz w:val="28"/>
         </w:rPr>
-        <w:t xml:space="preserve">  References</w:t>
+        <w:t>References</w:t>
       </w:r>
     </w:p>
     <w:p>

</xml_diff>